<commit_message>
template flextable and manuscript split function
</commit_message>
<xml_diff>
--- a/inst/template/format/word_plain_paper_style.docx
+++ b/inst/template/format/word_plain_paper_style.docx
@@ -15546,6 +15546,12 @@
     <w:qFormat/>
     <w:tblPr>
       <w:tblInd w:w="0" w:type="dxa"/>
+      <w:tblBorders>
+        <w:top w:val="single" w:sz="12" w:space="0" w:color="000000"/>
+        <w:bottom w:val="single" w:sz="12" w:space="0" w:color="000000"/>
+        <w:insideH w:val="none" w:sz="0" w:space="0" w:color="auto"/>
+        <w:insideV w:val="none" w:sz="0" w:space="0" w:color="auto"/>
+      </w:tblBorders>
       <w:tblCellMar>
         <w:top w:w="0" w:type="dxa"/>
         <w:left w:w="108" w:type="dxa"/>
@@ -15553,6 +15559,13 @@
         <w:right w:w="108" w:type="dxa"/>
       </w:tblCellMar>
     </w:tblPr>
+    <w:tblStylePr w:type="firstRow">
+      <w:tcPr>
+        <w:tcBorders>
+          <w:bottom w:val="single" w:sz="12" w:space="0" w:color="000000"/>
+        </w:tcBorders>
+      </w:tcPr>
+    </w:tblStylePr>
   </w:style>
   <w:style w:type="paragraph" w:customStyle="1" w:styleId="DefinitionTerm">
     <w:name w:val="Definition Term"/>

</xml_diff>